<commit_message>
updated manuscript and supporting information
</commit_message>
<xml_diff>
--- a/manuscript/MAIN_Manuscript_1 (AutoRecovered).docx
+++ b/manuscript/MAIN_Manuscript_1 (AutoRecovered).docx
@@ -6161,6 +6161,26 @@
         </w:rPr>
         <w:t>.</w:t>
       </w:r>
+      <w:r>
+        <w:rPr>
+          <w:rFonts w:ascii="Times New Roman" w:hAnsi="Times New Roman" w:cs="Times New Roman"/>
+        </w:rPr>
+        <w:t xml:space="preserve"> All the </w:t>
+      </w:r>
+      <w:proofErr w:type="gramStart"/>
+      <w:r>
+        <w:rPr>
+          <w:rFonts w:ascii="Times New Roman" w:hAnsi="Times New Roman" w:cs="Times New Roman"/>
+        </w:rPr>
+        <w:t>models</w:t>
+      </w:r>
+      <w:proofErr w:type="gramEnd"/>
+      <w:r>
+        <w:rPr>
+          <w:rFonts w:ascii="Times New Roman" w:hAnsi="Times New Roman" w:cs="Times New Roman"/>
+        </w:rPr>
+        <w:t xml:space="preserve"> summaries and the SHAP analysis of the models are available in the supporting information.</w:t>
+      </w:r>
     </w:p>
     <w:p>
       <w:pPr>
@@ -7251,6 +7271,7 @@
               <w:rPr>
                 <w:rFonts w:ascii="Times New Roman" w:hAnsi="Times New Roman" w:cs="Times New Roman"/>
               </w:rPr>
+              <w:lastRenderedPageBreak/>
               <w:t>RFECV</w:t>
             </w:r>
           </w:p>
@@ -7507,7 +7528,6 @@
               <w:rPr>
                 <w:rFonts w:ascii="Times New Roman" w:hAnsi="Times New Roman" w:cs="Times New Roman"/>
               </w:rPr>
-              <w:lastRenderedPageBreak/>
               <w:t>RFECV</w:t>
             </w:r>
           </w:p>
@@ -8337,6 +8357,7 @@
         <w:rPr>
           <w:rFonts w:ascii="Times New Roman" w:hAnsi="Times New Roman" w:cs="Times New Roman"/>
         </w:rPr>
+        <w:lastRenderedPageBreak/>
         <w:t>it learn</w:t>
       </w:r>
       <w:r>
@@ -8387,14 +8408,7 @@
         <w:rPr>
           <w:rFonts w:ascii="Times New Roman" w:hAnsi="Times New Roman" w:cs="Times New Roman"/>
         </w:rPr>
-        <w:t xml:space="preserve"> kinetics, </w:t>
-      </w:r>
-      <w:r>
-        <w:rPr>
-          <w:rFonts w:ascii="Times New Roman" w:hAnsi="Times New Roman" w:cs="Times New Roman"/>
-        </w:rPr>
-        <w:lastRenderedPageBreak/>
-        <w:t xml:space="preserve">which in turn changes </w:t>
+        <w:t xml:space="preserve"> kinetics, which in turn changes </w:t>
       </w:r>
       <w:proofErr w:type="spellStart"/>
       <w:r>
@@ -9151,7 +9165,14 @@
         <w:rPr>
           <w:rFonts w:ascii="Times New Roman" w:hAnsi="Times New Roman" w:cs="Times New Roman"/>
         </w:rPr>
-        <w:t xml:space="preserve"> (</w:t>
+        <w:t xml:space="preserve"> </w:t>
+      </w:r>
+      <w:r>
+        <w:rPr>
+          <w:rFonts w:ascii="Times New Roman" w:hAnsi="Times New Roman" w:cs="Times New Roman"/>
+        </w:rPr>
+        <w:lastRenderedPageBreak/>
+        <w:t>(</w:t>
       </w:r>
       <w:r>
         <w:rPr>
@@ -9271,7 +9292,6 @@
         <w:rPr>
           <w:rFonts w:ascii="Times New Roman" w:hAnsi="Times New Roman" w:cs="Times New Roman"/>
         </w:rPr>
-        <w:lastRenderedPageBreak/>
         <w:t>samples</w:t>
       </w:r>
       <w:r>
@@ -9510,13 +9530,51 @@
         <w:rPr>
           <w:rFonts w:ascii="Times New Roman" w:hAnsi="Times New Roman" w:cs="Times New Roman"/>
         </w:rPr>
-        <w:t xml:space="preserve"> SHAP for the SVR model</w:t>
-      </w:r>
-      <w:r>
-        <w:rPr>
-          <w:rFonts w:ascii="Times New Roman" w:hAnsi="Times New Roman" w:cs="Times New Roman"/>
-        </w:rPr>
-        <w:t xml:space="preserve"> (</w:t>
+        <w:t xml:space="preserve"> SHAP for the </w:t>
+      </w:r>
+      <w:proofErr w:type="spellStart"/>
+      <w:r>
+        <w:rPr>
+          <w:rFonts w:ascii="Times New Roman" w:hAnsi="Times New Roman" w:cs="Times New Roman"/>
+        </w:rPr>
+        <w:t>select_from_model</w:t>
+      </w:r>
+      <w:proofErr w:type="spellEnd"/>
+      <w:r>
+        <w:rPr>
+          <w:rFonts w:ascii="Times New Roman" w:hAnsi="Times New Roman" w:cs="Times New Roman"/>
+        </w:rPr>
+        <w:t xml:space="preserve"> </w:t>
+      </w:r>
+      <w:r>
+        <w:rPr>
+          <w:rFonts w:ascii="Times New Roman" w:hAnsi="Times New Roman" w:cs="Times New Roman"/>
+        </w:rPr>
+        <w:t xml:space="preserve">+ </w:t>
+      </w:r>
+      <w:r>
+        <w:rPr>
+          <w:rFonts w:ascii="Times New Roman" w:hAnsi="Times New Roman" w:cs="Times New Roman"/>
+        </w:rPr>
+        <w:t>SVR model</w:t>
+      </w:r>
+      <w:r>
+        <w:rPr>
+          <w:rFonts w:ascii="Times New Roman" w:hAnsi="Times New Roman" w:cs="Times New Roman"/>
+        </w:rPr>
+        <w:t xml:space="preserve"> </w:t>
+      </w:r>
+      <w:r>
+        <w:rPr>
+          <w:rFonts w:ascii="Times New Roman" w:hAnsi="Times New Roman" w:cs="Times New Roman"/>
+        </w:rPr>
+        <w:t xml:space="preserve">- </w:t>
+      </w:r>
+      <w:r>
+        <w:rPr>
+          <w:rFonts w:ascii="Times New Roman" w:hAnsi="Times New Roman" w:cs="Times New Roman"/>
+        </w:rPr>
+        <w:t>(</w:t>
       </w:r>
       <w:r>
         <w:rPr>
@@ -11603,7 +11661,31 @@
               <w:rPr>
                 <w:rFonts w:ascii="Times New Roman" w:hAnsi="Times New Roman" w:cs="Times New Roman"/>
               </w:rPr>
-              <w:t>Secondary-spacer flexibility/topology (mixed-spacer rows); perturbs interlayer spacing and local dielectric environment.</w:t>
+              <w:t>Secondary</w:t>
+            </w:r>
+            <w:r>
+              <w:rPr>
+                <w:rFonts w:ascii="Times New Roman" w:hAnsi="Times New Roman" w:cs="Times New Roman"/>
+              </w:rPr>
+              <w:t xml:space="preserve"> </w:t>
+            </w:r>
+            <w:r>
+              <w:rPr>
+                <w:rFonts w:ascii="Times New Roman" w:hAnsi="Times New Roman" w:cs="Times New Roman"/>
+              </w:rPr>
+              <w:t>spacer flexibility/topology (mixed</w:t>
+            </w:r>
+            <w:r>
+              <w:rPr>
+                <w:rFonts w:ascii="Times New Roman" w:hAnsi="Times New Roman" w:cs="Times New Roman"/>
+              </w:rPr>
+              <w:t xml:space="preserve"> s</w:t>
+            </w:r>
+            <w:r>
+              <w:rPr>
+                <w:rFonts w:ascii="Times New Roman" w:hAnsi="Times New Roman" w:cs="Times New Roman"/>
+              </w:rPr>
+              <w:t>pacer rows); perturbs interlayer spacing and local dielectric environment.</w:t>
             </w:r>
           </w:p>
         </w:tc>
@@ -11791,7 +11873,19 @@
               <w:rPr>
                 <w:rFonts w:ascii="Times New Roman" w:hAnsi="Times New Roman" w:cs="Times New Roman"/>
               </w:rPr>
-              <w:t xml:space="preserve"> because fewer entries use chloride-primary recipes.</w:t>
+              <w:t xml:space="preserve"> because fewer entries use chloride</w:t>
+            </w:r>
+            <w:r>
+              <w:rPr>
+                <w:rFonts w:ascii="Times New Roman" w:hAnsi="Times New Roman" w:cs="Times New Roman"/>
+              </w:rPr>
+              <w:t xml:space="preserve"> in </w:t>
+            </w:r>
+            <w:r>
+              <w:rPr>
+                <w:rFonts w:ascii="Times New Roman" w:hAnsi="Times New Roman" w:cs="Times New Roman"/>
+              </w:rPr>
+              <w:t>primary recipes.</w:t>
             </w:r>
           </w:p>
         </w:tc>
@@ -11909,7 +12003,31 @@
               <w:rPr>
                 <w:rFonts w:ascii="Times New Roman" w:hAnsi="Times New Roman" w:cs="Times New Roman"/>
               </w:rPr>
-              <w:t>Partial-charge-weighted VSA on the secondary ligand; fine-tunes mixed-spacer systems.</w:t>
+              <w:t>Partial-charge-weighted VSA on the secondary ligand; fine</w:t>
+            </w:r>
+            <w:r>
+              <w:rPr>
+                <w:rFonts w:ascii="Times New Roman" w:hAnsi="Times New Roman" w:cs="Times New Roman"/>
+              </w:rPr>
+              <w:t xml:space="preserve"> </w:t>
+            </w:r>
+            <w:r>
+              <w:rPr>
+                <w:rFonts w:ascii="Times New Roman" w:hAnsi="Times New Roman" w:cs="Times New Roman"/>
+              </w:rPr>
+              <w:t>tunes mixed</w:t>
+            </w:r>
+            <w:r>
+              <w:rPr>
+                <w:rFonts w:ascii="Times New Roman" w:hAnsi="Times New Roman" w:cs="Times New Roman"/>
+              </w:rPr>
+              <w:t xml:space="preserve"> </w:t>
+            </w:r>
+            <w:r>
+              <w:rPr>
+                <w:rFonts w:ascii="Times New Roman" w:hAnsi="Times New Roman" w:cs="Times New Roman"/>
+              </w:rPr>
+              <w:t>spacer systems.</w:t>
             </w:r>
           </w:p>
         </w:tc>
@@ -13834,8 +13952,10 @@
       <w:pPr>
         <w:pStyle w:val="FirstParagraph"/>
         <w:spacing w:line="480" w:lineRule="auto"/>
-        <w:ind w:firstLine="720"/>
         <w:jc w:val="both"/>
+        <w:rPr>
+          <w:rFonts w:ascii="Times New Roman" w:hAnsi="Times New Roman" w:cs="Times New Roman"/>
+        </w:rPr>
       </w:pPr>
       <w:r>
         <w:rPr>
@@ -13928,11 +14048,96 @@
         </w:rPr>
         <w:t>, which may vary from one laboratory report to another with the same set of recipes and device architectures.</w:t>
       </w:r>
-    </w:p>
-    <w:p>
-      <w:pPr>
-        <w:pStyle w:val="BodyText"/>
-      </w:pPr>
+      <w:r>
+        <w:rPr>
+          <w:rFonts w:ascii="Times New Roman" w:hAnsi="Times New Roman" w:cs="Times New Roman"/>
+        </w:rPr>
+        <w:t xml:space="preserve"> </w:t>
+      </w:r>
+      <w:r>
+        <w:rPr>
+          <w:rFonts w:ascii="Times New Roman" w:hAnsi="Times New Roman" w:cs="Times New Roman"/>
+        </w:rPr>
+        <w:t xml:space="preserve">These insights establish that chemically lean ML models are trustworthy for </w:t>
+      </w:r>
+      <w:r>
+        <w:rPr>
+          <w:rFonts w:ascii="Times New Roman" w:hAnsi="Times New Roman" w:cs="Times New Roman"/>
+        </w:rPr>
+        <w:lastRenderedPageBreak/>
+        <w:t>predicting intrinsic material properties (</w:t>
+      </w:r>
+      <w:r>
+        <w:rPr>
+          <w:rFonts w:ascii="Times New Roman" w:hAnsi="Times New Roman" w:cs="Times New Roman"/>
+        </w:rPr>
+        <w:t>E</w:t>
+      </w:r>
+      <w:r>
+        <w:rPr>
+          <w:rFonts w:ascii="Times New Roman" w:hAnsi="Times New Roman" w:cs="Times New Roman"/>
+          <w:i/>
+          <w:iCs/>
+          <w:vertAlign w:val="subscript"/>
+        </w:rPr>
+        <w:t>ph</w:t>
+      </w:r>
+      <w:r>
+        <w:rPr>
+          <w:rFonts w:ascii="Times New Roman" w:hAnsi="Times New Roman" w:cs="Times New Roman"/>
+        </w:rPr>
+        <w:t>)</w:t>
+      </w:r>
+      <w:r>
+        <w:rPr>
+          <w:rFonts w:ascii="Times New Roman" w:hAnsi="Times New Roman" w:cs="Times New Roman"/>
+        </w:rPr>
+        <w:t>,</w:t>
+      </w:r>
+      <w:r>
+        <w:rPr>
+          <w:rFonts w:ascii="Times New Roman" w:hAnsi="Times New Roman" w:cs="Times New Roman"/>
+        </w:rPr>
+        <w:t xml:space="preserve"> but device-based </w:t>
+      </w:r>
+      <w:r>
+        <w:rPr>
+          <w:rFonts w:ascii="Times New Roman" w:hAnsi="Times New Roman" w:cs="Times New Roman"/>
+        </w:rPr>
+        <w:t xml:space="preserve">metrics such as EQE remain fundamentally unlearnable across heterogeneous literature sources without strictly </w:t>
+      </w:r>
+      <w:proofErr w:type="spellStart"/>
+      <w:r>
+        <w:rPr>
+          <w:rFonts w:ascii="Times New Roman" w:hAnsi="Times New Roman" w:cs="Times New Roman"/>
+        </w:rPr>
+        <w:t>standardised</w:t>
+      </w:r>
+      <w:proofErr w:type="spellEnd"/>
+      <w:r>
+        <w:rPr>
+          <w:rFonts w:ascii="Times New Roman" w:hAnsi="Times New Roman" w:cs="Times New Roman"/>
+        </w:rPr>
+        <w:t xml:space="preserve"> </w:t>
+      </w:r>
+      <w:r>
+        <w:rPr>
+          <w:rFonts w:ascii="Times New Roman" w:hAnsi="Times New Roman" w:cs="Times New Roman"/>
+        </w:rPr>
+        <w:t>fabrication</w:t>
+      </w:r>
+      <w:r>
+        <w:rPr>
+          <w:rFonts w:ascii="Times New Roman" w:hAnsi="Times New Roman" w:cs="Times New Roman"/>
+        </w:rPr>
+        <w:t xml:space="preserve"> and testing </w:t>
+      </w:r>
+      <w:r>
+        <w:rPr>
+          <w:rFonts w:ascii="Times New Roman" w:hAnsi="Times New Roman" w:cs="Times New Roman"/>
+        </w:rPr>
+        <w:t>conditions.</w:t>
+      </w:r>
     </w:p>
     <w:p>
       <w:pPr>
@@ -14218,7 +14423,11 @@
         <w:t xml:space="preserve">This work was supported by the School of Chemistry, University of Hyderabad. </w:t>
       </w:r>
       <w:r>
-        <w:t>RRS acknowledges Council of Scientific and Industrial Research (CSIR) for the Senior Research Fellowship (SRF)</w:t>
+        <w:t xml:space="preserve">RRS acknowledges Council of Scientific and Industrial Research (CSIR) for the Senior Research </w:t>
+      </w:r>
+      <w:r>
+        <w:lastRenderedPageBreak/>
+        <w:t>Fellowship (SRF)</w:t>
       </w:r>
       <w:r>
         <w:t xml:space="preserve">. </w:t>
@@ -14343,7 +14552,6 @@
         <w:rPr>
           <w:rFonts w:ascii="Times New Roman" w:hAnsi="Times New Roman" w:cs="Times New Roman"/>
         </w:rPr>
-        <w:lastRenderedPageBreak/>
         <w:fldChar w:fldCharType="begin"/>
       </w:r>
       <w:r>
@@ -14839,6 +15047,7 @@
         <w:ind w:left="720" w:hanging="720"/>
       </w:pPr>
       <w:r>
+        <w:lastRenderedPageBreak/>
         <w:t>16.</w:t>
       </w:r>
       <w:r>
@@ -14903,7 +15112,6 @@
         <w:ind w:left="720" w:hanging="720"/>
       </w:pPr>
       <w:r>
-        <w:lastRenderedPageBreak/>
         <w:t>18.</w:t>
       </w:r>
       <w:r>
@@ -15073,74 +15281,6 @@
       </w:r>
       <w:bookmarkEnd w:id="0"/>
       <w:bookmarkEnd w:id="12"/>
-      <w:r>
-        <w:rPr>
-          <w:rFonts w:ascii="Times New Roman" w:hAnsi="Times New Roman" w:cs="Times New Roman"/>
-        </w:rPr>
-        <w:t xml:space="preserve"> </w:t>
-      </w:r>
-      <w:r>
-        <w:rPr>
-          <w:rFonts w:ascii="Times New Roman" w:hAnsi="Times New Roman" w:cs="Times New Roman"/>
-        </w:rPr>
-        <w:t xml:space="preserve">These insights establish that chemically lean ML models are trustworthy for </w:t>
-      </w:r>
-      <w:r>
-        <w:rPr>
-          <w:rFonts w:ascii="Times New Roman" w:hAnsi="Times New Roman" w:cs="Times New Roman"/>
-        </w:rPr>
-        <w:t>predicting intrinsic material properties (emission energy)</w:t>
-      </w:r>
-      <w:r>
-        <w:rPr>
-          <w:rFonts w:ascii="Times New Roman" w:hAnsi="Times New Roman" w:cs="Times New Roman"/>
-        </w:rPr>
-        <w:t>,</w:t>
-      </w:r>
-      <w:r>
-        <w:rPr>
-          <w:rFonts w:ascii="Times New Roman" w:hAnsi="Times New Roman" w:cs="Times New Roman"/>
-        </w:rPr>
-        <w:t xml:space="preserve"> but device-based </w:t>
-      </w:r>
-      <w:r>
-        <w:rPr>
-          <w:rFonts w:ascii="Times New Roman" w:hAnsi="Times New Roman" w:cs="Times New Roman"/>
-        </w:rPr>
-        <w:t xml:space="preserve">metrics such as EQE remain fundamentally unlearnable across heterogeneous literature sources without strictly </w:t>
-      </w:r>
-      <w:proofErr w:type="spellStart"/>
-      <w:r>
-        <w:rPr>
-          <w:rFonts w:ascii="Times New Roman" w:hAnsi="Times New Roman" w:cs="Times New Roman"/>
-        </w:rPr>
-        <w:t>standardised</w:t>
-      </w:r>
-      <w:proofErr w:type="spellEnd"/>
-      <w:r>
-        <w:rPr>
-          <w:rFonts w:ascii="Times New Roman" w:hAnsi="Times New Roman" w:cs="Times New Roman"/>
-        </w:rPr>
-        <w:t xml:space="preserve"> </w:t>
-      </w:r>
-      <w:r>
-        <w:rPr>
-          <w:rFonts w:ascii="Times New Roman" w:hAnsi="Times New Roman" w:cs="Times New Roman"/>
-        </w:rPr>
-        <w:t>fabrication</w:t>
-      </w:r>
-      <w:r>
-        <w:rPr>
-          <w:rFonts w:ascii="Times New Roman" w:hAnsi="Times New Roman" w:cs="Times New Roman"/>
-        </w:rPr>
-        <w:t xml:space="preserve"> and testing </w:t>
-      </w:r>
-      <w:r>
-        <w:rPr>
-          <w:rFonts w:ascii="Times New Roman" w:hAnsi="Times New Roman" w:cs="Times New Roman"/>
-        </w:rPr>
-        <w:t>conditions.</w:t>
-      </w:r>
     </w:p>
     <w:sectPr>
       <w:footerReference w:type="default" r:id="rId14"/>

</xml_diff>